<commit_message>
perbaiki template isian audit auditan
</commit_message>
<xml_diff>
--- a/storage/app/public/template/template_isi_audit_auditee.docx
+++ b/storage/app/public/template/template_isi_audit_auditee.docx
@@ -352,7 +352,6 @@
                 <w:szCs w:val="20"/>
               </w:rPr>
             </w:pPr>
-            <w:proofErr w:type="spellStart"/>
             <w:r>
               <w:rPr>
                 <w:rFonts w:ascii="Arial" w:hAnsi="Arial" w:cs="Arial"/>
@@ -361,9 +360,8 @@
                 <w:sz w:val="20"/>
                 <w:szCs w:val="20"/>
               </w:rPr>
-              <w:t>Tanggal</w:t>
+              <w:t xml:space="preserve">Tanggal </w:t>
             </w:r>
-            <w:proofErr w:type="spellEnd"/>
             <w:r>
               <w:rPr>
                 <w:rFonts w:ascii="Arial" w:hAnsi="Arial" w:cs="Arial"/>
@@ -372,7 +370,7 @@
                 <w:sz w:val="20"/>
                 <w:szCs w:val="20"/>
               </w:rPr>
-              <w:t xml:space="preserve"> Audit</w:t>
+              <w:t>Pengisian</w:t>
             </w:r>
           </w:p>
         </w:tc>
@@ -433,7 +431,6 @@
                 <w:szCs w:val="20"/>
               </w:rPr>
             </w:pPr>
-            <w:proofErr w:type="spellStart"/>
             <w:r>
               <w:rPr>
                 <w:rFonts w:ascii="Arial" w:hAnsi="Arial" w:cs="Arial"/>
@@ -454,7 +451,6 @@
               </w:rPr>
               <w:t>an</w:t>
             </w:r>
-            <w:proofErr w:type="spellEnd"/>
           </w:p>
         </w:tc>
         <w:tc>
@@ -707,7 +703,6 @@
                 <w:szCs w:val="20"/>
               </w:rPr>
             </w:pPr>
-            <w:proofErr w:type="spellStart"/>
             <w:r>
               <w:rPr>
                 <w:rFonts w:ascii="Arial" w:hAnsi="Arial" w:cs="Arial"/>
@@ -716,9 +711,8 @@
                 <w:sz w:val="20"/>
                 <w:szCs w:val="20"/>
               </w:rPr>
-              <w:t>Pertanyaan</w:t>
+              <w:t>Pernyataan Standar</w:t>
             </w:r>
-            <w:proofErr w:type="spellEnd"/>
           </w:p>
         </w:tc>
         <w:tc>
@@ -739,7 +733,6 @@
                 <w:szCs w:val="20"/>
               </w:rPr>
             </w:pPr>
-            <w:proofErr w:type="spellStart"/>
             <w:r>
               <w:rPr>
                 <w:rFonts w:ascii="Arial" w:hAnsi="Arial" w:cs="Arial"/>
@@ -750,7 +743,6 @@
               </w:rPr>
               <w:t>Jawaban</w:t>
             </w:r>
-            <w:proofErr w:type="spellEnd"/>
           </w:p>
         </w:tc>
         <w:tc>
@@ -831,25 +823,7 @@
                 <w:sz w:val="20"/>
                 <w:szCs w:val="20"/>
               </w:rPr>
-              <w:t>${</w:t>
-            </w:r>
-            <w:proofErr w:type="spellStart"/>
-            <w:r>
-              <w:rPr>
-                <w:rFonts w:ascii="Arial" w:hAnsi="Arial" w:cs="Arial"/>
-                <w:sz w:val="20"/>
-                <w:szCs w:val="20"/>
-              </w:rPr>
-              <w:t>kode</w:t>
-            </w:r>
-            <w:proofErr w:type="spellEnd"/>
-            <w:r>
-              <w:rPr>
-                <w:rFonts w:ascii="Arial" w:hAnsi="Arial" w:cs="Arial"/>
-                <w:sz w:val="20"/>
-                <w:szCs w:val="20"/>
-              </w:rPr>
-              <w:t>}</w:t>
+              <w:t>${kode}</w:t>
             </w:r>
           </w:p>
         </w:tc>
@@ -872,25 +846,7 @@
                 <w:sz w:val="20"/>
                 <w:szCs w:val="20"/>
               </w:rPr>
-              <w:t>${</w:t>
-            </w:r>
-            <w:proofErr w:type="spellStart"/>
-            <w:r>
-              <w:rPr>
-                <w:rFonts w:ascii="Arial" w:hAnsi="Arial" w:cs="Arial"/>
-                <w:sz w:val="20"/>
-                <w:szCs w:val="20"/>
-              </w:rPr>
-              <w:t>pernyataan</w:t>
-            </w:r>
-            <w:proofErr w:type="spellEnd"/>
-            <w:r>
-              <w:rPr>
-                <w:rFonts w:ascii="Arial" w:hAnsi="Arial" w:cs="Arial"/>
-                <w:sz w:val="20"/>
-                <w:szCs w:val="20"/>
-              </w:rPr>
-              <w:t>}</w:t>
+              <w:t>${pernyataan}</w:t>
             </w:r>
           </w:p>
         </w:tc>
@@ -913,25 +869,7 @@
                 <w:sz w:val="20"/>
                 <w:szCs w:val="20"/>
               </w:rPr>
-              <w:t>${</w:t>
-            </w:r>
-            <w:proofErr w:type="spellStart"/>
-            <w:r>
-              <w:rPr>
-                <w:rFonts w:ascii="Arial" w:hAnsi="Arial" w:cs="Arial"/>
-                <w:sz w:val="20"/>
-                <w:szCs w:val="20"/>
-              </w:rPr>
-              <w:t>jawaban</w:t>
-            </w:r>
-            <w:proofErr w:type="spellEnd"/>
-            <w:r>
-              <w:rPr>
-                <w:rFonts w:ascii="Arial" w:hAnsi="Arial" w:cs="Arial"/>
-                <w:sz w:val="20"/>
-                <w:szCs w:val="20"/>
-              </w:rPr>
-              <w:t>}</w:t>
+              <w:t>${jawaban}</w:t>
             </w:r>
           </w:p>
         </w:tc>

</xml_diff>